<commit_message>
feat: integrate Gemini 3 Flash into AI Study Advisor chat with Pakistani education context
</commit_message>
<xml_diff>
--- a/education_consultancy_final_architecture_1.docx
+++ b/education_consultancy_final_architecture_1.docx
@@ -1898,6 +1898,1357 @@
       <w:r>
         <w:br/>
       </w:r>
+    </w:p>
+    <w:p>
+      <w:pPr>
+        <w:rPr>
+          <w:szCs w:val="18"/>
+          <w:lang w:val="en-GB"/>
+        </w:rPr>
+      </w:pPr>
+    </w:p>
+    <w:p>
+      <w:pPr>
+        <w:rPr>
+          <w:szCs w:val="18"/>
+          <w:lang w:val="en-GB"/>
+        </w:rPr>
+      </w:pPr>
+    </w:p>
+    <w:p>
+      <w:pPr>
+        <w:rPr>
+          <w:szCs w:val="18"/>
+          <w:lang w:val="en-GB"/>
+        </w:rPr>
+      </w:pPr>
+    </w:p>
+    <w:p>
+      <w:pPr>
+        <w:rPr>
+          <w:szCs w:val="18"/>
+          <w:lang w:val="en-GB"/>
+        </w:rPr>
+      </w:pPr>
+    </w:p>
+    <w:p>
+      <w:pPr>
+        <w:rPr>
+          <w:szCs w:val="18"/>
+          <w:lang w:val="en-GB"/>
+        </w:rPr>
+      </w:pPr>
+    </w:p>
+    <w:p>
+      <w:pPr>
+        <w:rPr>
+          <w:szCs w:val="18"/>
+          <w:lang w:val="en-GB"/>
+        </w:rPr>
+      </w:pPr>
+    </w:p>
+    <w:p>
+      <w:pPr>
+        <w:rPr>
+          <w:szCs w:val="18"/>
+          <w:lang w:val="en-GB"/>
+        </w:rPr>
+      </w:pPr>
+    </w:p>
+    <w:p>
+      <w:pPr>
+        <w:rPr>
+          <w:szCs w:val="18"/>
+          <w:lang w:val="en-GB"/>
+        </w:rPr>
+      </w:pPr>
+    </w:p>
+    <w:p>
+      <w:pPr>
+        <w:rPr>
+          <w:szCs w:val="18"/>
+          <w:lang w:val="en-GB"/>
+        </w:rPr>
+      </w:pPr>
+    </w:p>
+    <w:p>
+      <w:pPr>
+        <w:rPr>
+          <w:szCs w:val="18"/>
+          <w:lang w:val="en-GB"/>
+        </w:rPr>
+      </w:pPr>
+    </w:p>
+    <w:p>
+      <w:pPr>
+        <w:rPr>
+          <w:szCs w:val="18"/>
+          <w:lang w:val="en-GB"/>
+        </w:rPr>
+      </w:pPr>
+    </w:p>
+    <w:p>
+      <w:pPr>
+        <w:jc w:val="center"/>
+        <w:rPr>
+          <w:b/>
+          <w:bCs/>
+          <w:sz w:val="48"/>
+          <w:szCs w:val="48"/>
+          <w:lang w:val="en-GB"/>
+        </w:rPr>
+      </w:pPr>
+      <w:r>
+        <w:rPr>
+          <w:b/>
+          <w:bCs/>
+          <w:sz w:val="48"/>
+          <w:szCs w:val="48"/>
+          <w:lang w:val="en-GB"/>
+        </w:rPr>
+        <w:lastRenderedPageBreak/>
+        <w:t>Upcoming Features</w:t>
+      </w:r>
+    </w:p>
+    <w:p>
+      <w:pPr>
+        <w:rPr>
+          <w:b/>
+          <w:bCs/>
+          <w:sz w:val="20"/>
+          <w:szCs w:val="20"/>
+          <w:lang w:val="en-GB"/>
+        </w:rPr>
+      </w:pPr>
+      <w:r>
+        <w:rPr>
+          <w:b/>
+          <w:bCs/>
+          <w:sz w:val="20"/>
+          <w:szCs w:val="20"/>
+          <w:lang w:val="en-GB"/>
+        </w:rPr>
+        <w:t>1. AI-Powered Application &amp; Document Tools </w:t>
+      </w:r>
+      <w:r>
+        <w:rPr>
+          <w:b/>
+          <w:bCs/>
+          <w:i/>
+          <w:iCs/>
+          <w:sz w:val="20"/>
+          <w:szCs w:val="20"/>
+          <w:lang w:val="en-GB"/>
+        </w:rPr>
+        <w:t>(Natural next step with LLM/RAG)</w:t>
+      </w:r>
+    </w:p>
+    <w:p>
+      <w:pPr>
+        <w:numPr>
+          <w:ilvl w:val="0"/>
+          <w:numId w:val="14"/>
+        </w:numPr>
+        <w:rPr>
+          <w:b/>
+          <w:bCs/>
+          <w:sz w:val="20"/>
+          <w:szCs w:val="20"/>
+          <w:lang w:val="en-GB"/>
+        </w:rPr>
+      </w:pPr>
+      <w:r>
+        <w:rPr>
+          <w:b/>
+          <w:bCs/>
+          <w:sz w:val="20"/>
+          <w:szCs w:val="20"/>
+          <w:lang w:val="en-GB"/>
+        </w:rPr>
+        <w:t>AI SOP &amp; Motivation Letter Reviewer:</w:t>
+      </w:r>
+    </w:p>
+    <w:p>
+      <w:pPr>
+        <w:numPr>
+          <w:ilvl w:val="1"/>
+          <w:numId w:val="14"/>
+        </w:numPr>
+        <w:rPr>
+          <w:b/>
+          <w:bCs/>
+          <w:sz w:val="20"/>
+          <w:szCs w:val="20"/>
+          <w:lang w:val="en-GB"/>
+        </w:rPr>
+      </w:pPr>
+      <w:r>
+        <w:rPr>
+          <w:b/>
+          <w:bCs/>
+          <w:sz w:val="20"/>
+          <w:szCs w:val="20"/>
+          <w:lang w:val="en-GB"/>
+        </w:rPr>
+        <w:t>Pakistani students struggle the most with Statement of Purpose (SOP) writing.</w:t>
+      </w:r>
+    </w:p>
+    <w:p>
+      <w:pPr>
+        <w:numPr>
+          <w:ilvl w:val="1"/>
+          <w:numId w:val="14"/>
+        </w:numPr>
+        <w:rPr>
+          <w:b/>
+          <w:bCs/>
+          <w:sz w:val="20"/>
+          <w:szCs w:val="20"/>
+          <w:lang w:val="en-GB"/>
+        </w:rPr>
+      </w:pPr>
+      <w:r>
+        <w:rPr>
+          <w:b/>
+          <w:bCs/>
+          <w:sz w:val="20"/>
+          <w:szCs w:val="20"/>
+          <w:lang w:val="en-GB"/>
+        </w:rPr>
+        <w:t>An AI tool that reads their profile (CGPA, degree, chosen university) and evaluates their draft against Embassy refusal criteria (e.g., UKVI Genuine Student requirement, German letter of motivation standards).</w:t>
+      </w:r>
+    </w:p>
+    <w:p>
+      <w:pPr>
+        <w:numPr>
+          <w:ilvl w:val="1"/>
+          <w:numId w:val="14"/>
+        </w:numPr>
+        <w:rPr>
+          <w:b/>
+          <w:bCs/>
+          <w:sz w:val="20"/>
+          <w:szCs w:val="20"/>
+          <w:lang w:val="en-GB"/>
+        </w:rPr>
+      </w:pPr>
+      <w:r>
+        <w:rPr>
+          <w:b/>
+          <w:bCs/>
+          <w:sz w:val="20"/>
+          <w:szCs w:val="20"/>
+          <w:lang w:val="en-GB"/>
+        </w:rPr>
+        <w:t>Flags generic clichés, weak career progression justifications, and provides actionable rewrites.</w:t>
+      </w:r>
+    </w:p>
+    <w:p>
+      <w:pPr>
+        <w:numPr>
+          <w:ilvl w:val="0"/>
+          <w:numId w:val="14"/>
+        </w:numPr>
+        <w:rPr>
+          <w:b/>
+          <w:bCs/>
+          <w:sz w:val="20"/>
+          <w:szCs w:val="20"/>
+          <w:lang w:val="en-GB"/>
+        </w:rPr>
+      </w:pPr>
+      <w:proofErr w:type="spellStart"/>
+      <w:r>
+        <w:rPr>
+          <w:b/>
+          <w:bCs/>
+          <w:sz w:val="20"/>
+          <w:szCs w:val="20"/>
+          <w:lang w:val="en-GB"/>
+        </w:rPr>
+        <w:t>Europass</w:t>
+      </w:r>
+      <w:proofErr w:type="spellEnd"/>
+      <w:r>
+        <w:rPr>
+          <w:b/>
+          <w:bCs/>
+          <w:sz w:val="20"/>
+          <w:szCs w:val="20"/>
+          <w:lang w:val="en-GB"/>
+        </w:rPr>
+        <w:t xml:space="preserve"> &amp; Academic CV Builder:</w:t>
+      </w:r>
+    </w:p>
+    <w:p>
+      <w:pPr>
+        <w:numPr>
+          <w:ilvl w:val="1"/>
+          <w:numId w:val="14"/>
+        </w:numPr>
+        <w:rPr>
+          <w:b/>
+          <w:bCs/>
+          <w:sz w:val="20"/>
+          <w:szCs w:val="20"/>
+          <w:lang w:val="en-GB"/>
+        </w:rPr>
+      </w:pPr>
+      <w:r>
+        <w:rPr>
+          <w:b/>
+          <w:bCs/>
+          <w:sz w:val="20"/>
+          <w:szCs w:val="20"/>
+          <w:lang w:val="en-GB"/>
+        </w:rPr>
+        <w:t>German universities mandate the </w:t>
+      </w:r>
+      <w:proofErr w:type="spellStart"/>
+      <w:r>
+        <w:rPr>
+          <w:b/>
+          <w:bCs/>
+          <w:sz w:val="20"/>
+          <w:szCs w:val="20"/>
+          <w:lang w:val="en-GB"/>
+        </w:rPr>
+        <w:t>Europass</w:t>
+      </w:r>
+      <w:proofErr w:type="spellEnd"/>
+      <w:r>
+        <w:rPr>
+          <w:b/>
+          <w:bCs/>
+          <w:sz w:val="20"/>
+          <w:szCs w:val="20"/>
+          <w:lang w:val="en-GB"/>
+        </w:rPr>
+        <w:t xml:space="preserve"> CV format with reverse-chronological details and specific layout rules.</w:t>
+      </w:r>
+    </w:p>
+    <w:p>
+      <w:pPr>
+        <w:numPr>
+          <w:ilvl w:val="1"/>
+          <w:numId w:val="14"/>
+        </w:numPr>
+        <w:rPr>
+          <w:b/>
+          <w:bCs/>
+          <w:sz w:val="20"/>
+          <w:szCs w:val="20"/>
+          <w:lang w:val="en-GB"/>
+        </w:rPr>
+      </w:pPr>
+      <w:r>
+        <w:rPr>
+          <w:b/>
+          <w:bCs/>
+          <w:sz w:val="20"/>
+          <w:szCs w:val="20"/>
+          <w:lang w:val="en-GB"/>
+        </w:rPr>
+        <w:t xml:space="preserve">Automatically export their </w:t>
+      </w:r>
+      <w:proofErr w:type="spellStart"/>
+      <w:r>
+        <w:rPr>
+          <w:b/>
+          <w:bCs/>
+          <w:sz w:val="20"/>
+          <w:szCs w:val="20"/>
+          <w:lang w:val="en-GB"/>
+        </w:rPr>
+        <w:t>UniCompass</w:t>
+      </w:r>
+      <w:proofErr w:type="spellEnd"/>
+      <w:r>
+        <w:rPr>
+          <w:b/>
+          <w:bCs/>
+          <w:sz w:val="20"/>
+          <w:szCs w:val="20"/>
+          <w:lang w:val="en-GB"/>
+        </w:rPr>
+        <w:t xml:space="preserve"> profile into a formatted </w:t>
+      </w:r>
+      <w:proofErr w:type="spellStart"/>
+      <w:r>
+        <w:rPr>
+          <w:b/>
+          <w:bCs/>
+          <w:sz w:val="20"/>
+          <w:szCs w:val="20"/>
+          <w:lang w:val="en-GB"/>
+        </w:rPr>
+        <w:t>Europass</w:t>
+      </w:r>
+      <w:proofErr w:type="spellEnd"/>
+      <w:r>
+        <w:rPr>
+          <w:b/>
+          <w:bCs/>
+          <w:sz w:val="20"/>
+          <w:szCs w:val="20"/>
+          <w:lang w:val="en-GB"/>
+        </w:rPr>
+        <w:t xml:space="preserve"> PDF or UK-standard 2-page academic CV.</w:t>
+      </w:r>
+    </w:p>
+    <w:p>
+      <w:pPr>
+        <w:rPr>
+          <w:b/>
+          <w:bCs/>
+          <w:sz w:val="20"/>
+          <w:szCs w:val="20"/>
+          <w:lang w:val="en-GB"/>
+        </w:rPr>
+      </w:pPr>
+    </w:p>
+    <w:p>
+      <w:pPr>
+        <w:rPr>
+          <w:b/>
+          <w:bCs/>
+          <w:sz w:val="20"/>
+          <w:szCs w:val="20"/>
+          <w:lang w:val="en-GB"/>
+        </w:rPr>
+      </w:pPr>
+      <w:r>
+        <w:rPr>
+          <w:b/>
+          <w:bCs/>
+          <w:sz w:val="20"/>
+          <w:szCs w:val="20"/>
+          <w:lang w:val="en-GB"/>
+        </w:rPr>
+        <w:t>2. Pakistani Embassy &amp; Financial Calculators</w:t>
+      </w:r>
+    </w:p>
+    <w:p>
+      <w:pPr>
+        <w:numPr>
+          <w:ilvl w:val="0"/>
+          <w:numId w:val="15"/>
+        </w:numPr>
+        <w:rPr>
+          <w:b/>
+          <w:bCs/>
+          <w:sz w:val="20"/>
+          <w:szCs w:val="20"/>
+          <w:lang w:val="en-GB"/>
+        </w:rPr>
+      </w:pPr>
+      <w:r>
+        <w:rPr>
+          <w:b/>
+          <w:bCs/>
+          <w:sz w:val="20"/>
+          <w:szCs w:val="20"/>
+          <w:lang w:val="en-GB"/>
+        </w:rPr>
+        <w:t>Interactive Bavarian Formula Grade Converter (German Equivalency):</w:t>
+      </w:r>
+    </w:p>
+    <w:p>
+      <w:pPr>
+        <w:numPr>
+          <w:ilvl w:val="1"/>
+          <w:numId w:val="15"/>
+        </w:numPr>
+        <w:rPr>
+          <w:b/>
+          <w:bCs/>
+          <w:sz w:val="20"/>
+          <w:szCs w:val="20"/>
+          <w:lang w:val="en-GB"/>
+        </w:rPr>
+      </w:pPr>
+      <w:r>
+        <w:rPr>
+          <w:b/>
+          <w:bCs/>
+          <w:sz w:val="20"/>
+          <w:szCs w:val="20"/>
+          <w:lang w:val="en-GB"/>
+        </w:rPr>
+        <w:t>German universities evaluate Pakistani GPAs using the Modified Bavarian Formula: </w:t>
+      </w:r>
+      <m:oMath>
+        <m:r>
+          <m:rPr>
+            <m:nor/>
+          </m:rPr>
+          <w:rPr>
+            <w:b/>
+            <w:bCs/>
+            <w:sz w:val="20"/>
+            <w:szCs w:val="20"/>
+            <w:lang w:val="en-GB"/>
+          </w:rPr>
+          <m:t>German Grade</m:t>
+        </m:r>
+        <m:r>
+          <m:rPr>
+            <m:sty m:val="bi"/>
+          </m:rPr>
+          <w:rPr>
+            <w:rFonts w:ascii="Cambria Math" w:hAnsi="Cambria Math"/>
+            <w:sz w:val="20"/>
+            <w:szCs w:val="20"/>
+            <w:lang w:val="en-GB"/>
+          </w:rPr>
+          <m:t>=1+3×</m:t>
+        </m:r>
+        <m:f>
+          <m:fPr>
+            <m:ctrlPr>
+              <w:rPr>
+                <w:rFonts w:ascii="Cambria Math" w:hAnsi="Cambria Math"/>
+                <w:b/>
+                <w:bCs/>
+                <w:sz w:val="20"/>
+                <w:szCs w:val="20"/>
+                <w:lang w:val="en-GB"/>
+              </w:rPr>
+            </m:ctrlPr>
+          </m:fPr>
+          <m:num>
+            <m:sSub>
+              <m:sSubPr>
+                <m:ctrlPr>
+                  <w:rPr>
+                    <w:rFonts w:ascii="Cambria Math" w:hAnsi="Cambria Math"/>
+                    <w:b/>
+                    <w:bCs/>
+                    <w:sz w:val="20"/>
+                    <w:szCs w:val="20"/>
+                    <w:lang w:val="en-GB"/>
+                  </w:rPr>
+                </m:ctrlPr>
+              </m:sSubPr>
+              <m:e>
+                <m:r>
+                  <m:rPr>
+                    <m:sty m:val="bi"/>
+                  </m:rPr>
+                  <w:rPr>
+                    <w:rFonts w:ascii="Cambria Math" w:hAnsi="Cambria Math"/>
+                    <w:sz w:val="20"/>
+                    <w:szCs w:val="20"/>
+                    <w:lang w:val="en-GB"/>
+                  </w:rPr>
+                  <m:t>N</m:t>
+                </m:r>
+              </m:e>
+              <m:sub>
+                <m:r>
+                  <m:rPr>
+                    <m:sty m:val="b"/>
+                  </m:rPr>
+                  <w:rPr>
+                    <w:rFonts w:ascii="Cambria Math" w:hAnsi="Cambria Math"/>
+                    <w:sz w:val="20"/>
+                    <w:szCs w:val="20"/>
+                    <w:lang w:val="en-GB"/>
+                  </w:rPr>
+                  <m:t>max</m:t>
+                </m:r>
+              </m:sub>
+            </m:sSub>
+            <m:r>
+              <m:rPr>
+                <m:sty m:val="bi"/>
+              </m:rPr>
+              <w:rPr>
+                <w:rFonts w:ascii="Cambria Math" w:hAnsi="Cambria Math"/>
+                <w:sz w:val="20"/>
+                <w:szCs w:val="20"/>
+                <w:lang w:val="en-GB"/>
+              </w:rPr>
+              <m:t>-</m:t>
+            </m:r>
+            <m:sSub>
+              <m:sSubPr>
+                <m:ctrlPr>
+                  <w:rPr>
+                    <w:rFonts w:ascii="Cambria Math" w:hAnsi="Cambria Math"/>
+                    <w:b/>
+                    <w:bCs/>
+                    <w:sz w:val="20"/>
+                    <w:szCs w:val="20"/>
+                    <w:lang w:val="en-GB"/>
+                  </w:rPr>
+                </m:ctrlPr>
+              </m:sSubPr>
+              <m:e>
+                <m:r>
+                  <m:rPr>
+                    <m:sty m:val="bi"/>
+                  </m:rPr>
+                  <w:rPr>
+                    <w:rFonts w:ascii="Cambria Math" w:hAnsi="Cambria Math"/>
+                    <w:sz w:val="20"/>
+                    <w:szCs w:val="20"/>
+                    <w:lang w:val="en-GB"/>
+                  </w:rPr>
+                  <m:t>N</m:t>
+                </m:r>
+              </m:e>
+              <m:sub>
+                <m:r>
+                  <m:rPr>
+                    <m:nor/>
+                  </m:rPr>
+                  <w:rPr>
+                    <w:b/>
+                    <w:bCs/>
+                    <w:sz w:val="20"/>
+                    <w:szCs w:val="20"/>
+                    <w:lang w:val="en-GB"/>
+                  </w:rPr>
+                  <m:t>student</m:t>
+                </m:r>
+              </m:sub>
+            </m:sSub>
+          </m:num>
+          <m:den>
+            <m:sSub>
+              <m:sSubPr>
+                <m:ctrlPr>
+                  <w:rPr>
+                    <w:rFonts w:ascii="Cambria Math" w:hAnsi="Cambria Math"/>
+                    <w:b/>
+                    <w:bCs/>
+                    <w:sz w:val="20"/>
+                    <w:szCs w:val="20"/>
+                    <w:lang w:val="en-GB"/>
+                  </w:rPr>
+                </m:ctrlPr>
+              </m:sSubPr>
+              <m:e>
+                <m:r>
+                  <m:rPr>
+                    <m:sty m:val="bi"/>
+                  </m:rPr>
+                  <w:rPr>
+                    <w:rFonts w:ascii="Cambria Math" w:hAnsi="Cambria Math"/>
+                    <w:sz w:val="20"/>
+                    <w:szCs w:val="20"/>
+                    <w:lang w:val="en-GB"/>
+                  </w:rPr>
+                  <m:t>N</m:t>
+                </m:r>
+              </m:e>
+              <m:sub>
+                <m:r>
+                  <m:rPr>
+                    <m:sty m:val="b"/>
+                  </m:rPr>
+                  <w:rPr>
+                    <w:rFonts w:ascii="Cambria Math" w:hAnsi="Cambria Math"/>
+                    <w:sz w:val="20"/>
+                    <w:szCs w:val="20"/>
+                    <w:lang w:val="en-GB"/>
+                  </w:rPr>
+                  <m:t>max</m:t>
+                </m:r>
+              </m:sub>
+            </m:sSub>
+            <m:r>
+              <m:rPr>
+                <m:sty m:val="bi"/>
+              </m:rPr>
+              <w:rPr>
+                <w:rFonts w:ascii="Cambria Math" w:hAnsi="Cambria Math"/>
+                <w:sz w:val="20"/>
+                <w:szCs w:val="20"/>
+                <w:lang w:val="en-GB"/>
+              </w:rPr>
+              <m:t>-</m:t>
+            </m:r>
+            <m:sSub>
+              <m:sSubPr>
+                <m:ctrlPr>
+                  <w:rPr>
+                    <w:rFonts w:ascii="Cambria Math" w:hAnsi="Cambria Math"/>
+                    <w:b/>
+                    <w:bCs/>
+                    <w:sz w:val="20"/>
+                    <w:szCs w:val="20"/>
+                    <w:lang w:val="en-GB"/>
+                  </w:rPr>
+                </m:ctrlPr>
+              </m:sSubPr>
+              <m:e>
+                <m:r>
+                  <m:rPr>
+                    <m:sty m:val="bi"/>
+                  </m:rPr>
+                  <w:rPr>
+                    <w:rFonts w:ascii="Cambria Math" w:hAnsi="Cambria Math"/>
+                    <w:sz w:val="20"/>
+                    <w:szCs w:val="20"/>
+                    <w:lang w:val="en-GB"/>
+                  </w:rPr>
+                  <m:t>N</m:t>
+                </m:r>
+              </m:e>
+              <m:sub>
+                <m:r>
+                  <m:rPr>
+                    <m:sty m:val="b"/>
+                  </m:rPr>
+                  <w:rPr>
+                    <w:rFonts w:ascii="Cambria Math" w:hAnsi="Cambria Math"/>
+                    <w:sz w:val="20"/>
+                    <w:szCs w:val="20"/>
+                    <w:lang w:val="en-GB"/>
+                  </w:rPr>
+                  <m:t>min</m:t>
+                </m:r>
+              </m:sub>
+            </m:sSub>
+          </m:den>
+        </m:f>
+      </m:oMath>
+    </w:p>
+    <w:p>
+      <w:pPr>
+        <w:numPr>
+          <w:ilvl w:val="1"/>
+          <w:numId w:val="15"/>
+        </w:numPr>
+        <w:rPr>
+          <w:b/>
+          <w:bCs/>
+          <w:sz w:val="20"/>
+          <w:szCs w:val="20"/>
+          <w:lang w:val="en-GB"/>
+        </w:rPr>
+      </w:pPr>
+      <w:r>
+        <w:rPr>
+          <w:b/>
+          <w:bCs/>
+          <w:sz w:val="20"/>
+          <w:szCs w:val="20"/>
+          <w:lang w:val="en-GB"/>
+        </w:rPr>
+        <w:t>An interactive calculator where students enter their HEC CGPA (e.g. 3.2 / 4.0) and instantly see their German grade (e.g. 2.2 = </w:t>
+      </w:r>
+      <w:r>
+        <w:rPr>
+          <w:b/>
+          <w:bCs/>
+          <w:i/>
+          <w:iCs/>
+          <w:sz w:val="20"/>
+          <w:szCs w:val="20"/>
+          <w:lang w:val="en-GB"/>
+        </w:rPr>
+        <w:t>"Gut"</w:t>
+      </w:r>
+      <w:r>
+        <w:rPr>
+          <w:b/>
+          <w:bCs/>
+          <w:sz w:val="20"/>
+          <w:szCs w:val="20"/>
+          <w:lang w:val="en-GB"/>
+        </w:rPr>
+        <w:t>) and whether they pass the 2.5 cutoff.</w:t>
+      </w:r>
+    </w:p>
+    <w:p>
+      <w:pPr>
+        <w:numPr>
+          <w:ilvl w:val="0"/>
+          <w:numId w:val="15"/>
+        </w:numPr>
+        <w:rPr>
+          <w:b/>
+          <w:bCs/>
+          <w:sz w:val="20"/>
+          <w:szCs w:val="20"/>
+          <w:lang w:val="en-GB"/>
+        </w:rPr>
+      </w:pPr>
+      <w:r>
+        <w:rPr>
+          <w:b/>
+          <w:bCs/>
+          <w:sz w:val="20"/>
+          <w:szCs w:val="20"/>
+          <w:lang w:val="en-GB"/>
+        </w:rPr>
+        <w:t>Live Blocked Account &amp; Remittance Cost Calculator:</w:t>
+      </w:r>
+    </w:p>
+    <w:p>
+      <w:pPr>
+        <w:numPr>
+          <w:ilvl w:val="1"/>
+          <w:numId w:val="15"/>
+        </w:numPr>
+        <w:rPr>
+          <w:b/>
+          <w:bCs/>
+          <w:sz w:val="20"/>
+          <w:szCs w:val="20"/>
+          <w:lang w:val="en-GB"/>
+        </w:rPr>
+      </w:pPr>
+      <w:r>
+        <w:rPr>
+          <w:b/>
+          <w:bCs/>
+          <w:sz w:val="20"/>
+          <w:szCs w:val="20"/>
+          <w:lang w:val="en-GB"/>
+        </w:rPr>
+        <w:t>Shows exact costs in PKR for Germany's Blocked Account (€11,904) or UKVI living expense balance.</w:t>
+      </w:r>
+    </w:p>
+    <w:p>
+      <w:pPr>
+        <w:numPr>
+          <w:ilvl w:val="1"/>
+          <w:numId w:val="15"/>
+        </w:numPr>
+        <w:rPr>
+          <w:b/>
+          <w:bCs/>
+          <w:sz w:val="20"/>
+          <w:szCs w:val="20"/>
+          <w:lang w:val="en-GB"/>
+        </w:rPr>
+      </w:pPr>
+      <w:r>
+        <w:rPr>
+          <w:b/>
+          <w:bCs/>
+          <w:sz w:val="20"/>
+          <w:szCs w:val="20"/>
+          <w:lang w:val="en-GB"/>
+        </w:rPr>
+        <w:t>Automatically accounts for state bank exchange rates, interbank margins, and Pakistani bank wire charges (FBR tax filer vs. non-filer withholding rates).</w:t>
+      </w:r>
+    </w:p>
+    <w:p>
+      <w:pPr>
+        <w:rPr>
+          <w:b/>
+          <w:bCs/>
+          <w:sz w:val="20"/>
+          <w:szCs w:val="20"/>
+          <w:lang w:val="en-GB"/>
+        </w:rPr>
+      </w:pPr>
+    </w:p>
+    <w:p>
+      <w:pPr>
+        <w:rPr>
+          <w:b/>
+          <w:bCs/>
+          <w:sz w:val="20"/>
+          <w:szCs w:val="20"/>
+          <w:lang w:val="en-GB"/>
+        </w:rPr>
+      </w:pPr>
+    </w:p>
+    <w:p>
+      <w:pPr>
+        <w:rPr>
+          <w:b/>
+          <w:bCs/>
+          <w:sz w:val="20"/>
+          <w:szCs w:val="20"/>
+          <w:lang w:val="en-GB"/>
+        </w:rPr>
+      </w:pPr>
+      <w:r>
+        <w:rPr>
+          <w:b/>
+          <w:bCs/>
+          <w:sz w:val="20"/>
+          <w:szCs w:val="20"/>
+          <w:lang w:val="en-GB"/>
+        </w:rPr>
+        <w:lastRenderedPageBreak/>
+        <w:t>3. Germany APS &amp; Visa Appointment Pipeline</w:t>
+      </w:r>
+    </w:p>
+    <w:p>
+      <w:pPr>
+        <w:numPr>
+          <w:ilvl w:val="0"/>
+          <w:numId w:val="16"/>
+        </w:numPr>
+        <w:rPr>
+          <w:b/>
+          <w:bCs/>
+          <w:sz w:val="20"/>
+          <w:szCs w:val="20"/>
+          <w:lang w:val="en-GB"/>
+        </w:rPr>
+      </w:pPr>
+      <w:r>
+        <w:rPr>
+          <w:b/>
+          <w:bCs/>
+          <w:sz w:val="20"/>
+          <w:szCs w:val="20"/>
+          <w:lang w:val="en-GB"/>
+        </w:rPr>
+        <w:t>APS (</w:t>
+      </w:r>
+      <w:proofErr w:type="spellStart"/>
+      <w:r>
+        <w:rPr>
+          <w:b/>
+          <w:bCs/>
+          <w:sz w:val="20"/>
+          <w:szCs w:val="20"/>
+          <w:lang w:val="en-GB"/>
+        </w:rPr>
+        <w:t>Akademische</w:t>
+      </w:r>
+      <w:proofErr w:type="spellEnd"/>
+      <w:r>
+        <w:rPr>
+          <w:b/>
+          <w:bCs/>
+          <w:sz w:val="20"/>
+          <w:szCs w:val="20"/>
+          <w:lang w:val="en-GB"/>
+        </w:rPr>
+        <w:t xml:space="preserve"> </w:t>
+      </w:r>
+      <w:proofErr w:type="spellStart"/>
+      <w:r>
+        <w:rPr>
+          <w:b/>
+          <w:bCs/>
+          <w:sz w:val="20"/>
+          <w:szCs w:val="20"/>
+          <w:lang w:val="en-GB"/>
+        </w:rPr>
+        <w:t>Prüfstelle</w:t>
+      </w:r>
+      <w:proofErr w:type="spellEnd"/>
+      <w:r>
+        <w:rPr>
+          <w:b/>
+          <w:bCs/>
+          <w:sz w:val="20"/>
+          <w:szCs w:val="20"/>
+          <w:lang w:val="en-GB"/>
+        </w:rPr>
+        <w:t>) Tracker:</w:t>
+      </w:r>
+    </w:p>
+    <w:p>
+      <w:pPr>
+        <w:numPr>
+          <w:ilvl w:val="1"/>
+          <w:numId w:val="16"/>
+        </w:numPr>
+        <w:rPr>
+          <w:b/>
+          <w:bCs/>
+          <w:sz w:val="20"/>
+          <w:szCs w:val="20"/>
+          <w:lang w:val="en-GB"/>
+        </w:rPr>
+      </w:pPr>
+      <w:r>
+        <w:rPr>
+          <w:b/>
+          <w:bCs/>
+          <w:sz w:val="20"/>
+          <w:szCs w:val="20"/>
+          <w:lang w:val="en-GB"/>
+        </w:rPr>
+        <w:t>Since late 2023, all Pakistani students applying to Germany must obtain an APS certificate from the German Embassy in Islamabad before visa filing.</w:t>
+      </w:r>
+    </w:p>
+    <w:p>
+      <w:pPr>
+        <w:numPr>
+          <w:ilvl w:val="1"/>
+          <w:numId w:val="16"/>
+        </w:numPr>
+        <w:rPr>
+          <w:b/>
+          <w:bCs/>
+          <w:sz w:val="20"/>
+          <w:szCs w:val="20"/>
+          <w:lang w:val="en-GB"/>
+        </w:rPr>
+      </w:pPr>
+      <w:r>
+        <w:rPr>
+          <w:b/>
+          <w:bCs/>
+          <w:sz w:val="20"/>
+          <w:szCs w:val="20"/>
+          <w:lang w:val="en-GB"/>
+        </w:rPr>
+        <w:t>A dedicated tracking module for: APS online registration, document dispatch via TCS, and verification status.</w:t>
+      </w:r>
+    </w:p>
+    <w:p>
+      <w:pPr>
+        <w:numPr>
+          <w:ilvl w:val="0"/>
+          <w:numId w:val="16"/>
+        </w:numPr>
+        <w:rPr>
+          <w:b/>
+          <w:bCs/>
+          <w:sz w:val="20"/>
+          <w:szCs w:val="20"/>
+          <w:lang w:val="en-GB"/>
+        </w:rPr>
+      </w:pPr>
+      <w:r>
+        <w:rPr>
+          <w:b/>
+          <w:bCs/>
+          <w:sz w:val="20"/>
+          <w:szCs w:val="20"/>
+          <w:lang w:val="en-GB"/>
+        </w:rPr>
+        <w:t>Embassy Waitlist Estimator:</w:t>
+      </w:r>
+    </w:p>
+    <w:p>
+      <w:pPr>
+        <w:numPr>
+          <w:ilvl w:val="1"/>
+          <w:numId w:val="16"/>
+        </w:numPr>
+        <w:rPr>
+          <w:b/>
+          <w:bCs/>
+          <w:sz w:val="20"/>
+          <w:szCs w:val="20"/>
+          <w:lang w:val="en-GB"/>
+        </w:rPr>
+      </w:pPr>
+      <w:r>
+        <w:rPr>
+          <w:b/>
+          <w:bCs/>
+          <w:sz w:val="20"/>
+          <w:szCs w:val="20"/>
+          <w:lang w:val="en-GB"/>
+        </w:rPr>
+        <w:t>German embassy appointment waitlists in Islamabad and Karachi take anywhere from 8 to 14 months.</w:t>
+      </w:r>
+    </w:p>
+    <w:p>
+      <w:pPr>
+        <w:numPr>
+          <w:ilvl w:val="1"/>
+          <w:numId w:val="16"/>
+        </w:numPr>
+        <w:rPr>
+          <w:b/>
+          <w:bCs/>
+          <w:sz w:val="20"/>
+          <w:szCs w:val="20"/>
+          <w:lang w:val="en-GB"/>
+        </w:rPr>
+      </w:pPr>
+      <w:r>
+        <w:rPr>
+          <w:b/>
+          <w:bCs/>
+          <w:sz w:val="20"/>
+          <w:szCs w:val="20"/>
+          <w:lang w:val="en-GB"/>
+        </w:rPr>
+        <w:t>An estimator or community-reported waitlist tracker (e.g. </w:t>
+      </w:r>
+      <w:r>
+        <w:rPr>
+          <w:b/>
+          <w:bCs/>
+          <w:i/>
+          <w:iCs/>
+          <w:sz w:val="20"/>
+          <w:szCs w:val="20"/>
+          <w:lang w:val="en-GB"/>
+        </w:rPr>
+        <w:t>"Students who booked in October 2025 are currently receiving appointment invitations"</w:t>
+      </w:r>
+      <w:r>
+        <w:rPr>
+          <w:b/>
+          <w:bCs/>
+          <w:sz w:val="20"/>
+          <w:szCs w:val="20"/>
+          <w:lang w:val="en-GB"/>
+        </w:rPr>
+        <w:t>).</w:t>
+      </w:r>
+    </w:p>
+    <w:p>
+      <w:pPr>
+        <w:rPr>
+          <w:b/>
+          <w:bCs/>
+          <w:sz w:val="20"/>
+          <w:szCs w:val="20"/>
+          <w:lang w:val="en-GB"/>
+        </w:rPr>
+      </w:pPr>
+    </w:p>
+    <w:p>
+      <w:pPr>
+        <w:rPr>
+          <w:b/>
+          <w:bCs/>
+          <w:sz w:val="20"/>
+          <w:szCs w:val="20"/>
+          <w:lang w:val="en-GB"/>
+        </w:rPr>
+      </w:pPr>
+    </w:p>
+    <w:p>
+      <w:pPr>
+        <w:rPr>
+          <w:b/>
+          <w:bCs/>
+          <w:sz w:val="20"/>
+          <w:szCs w:val="20"/>
+          <w:lang w:val="en-GB"/>
+        </w:rPr>
+      </w:pPr>
+      <w:r>
+        <w:rPr>
+          <w:b/>
+          <w:bCs/>
+          <w:sz w:val="20"/>
+          <w:szCs w:val="20"/>
+          <w:lang w:val="en-GB"/>
+        </w:rPr>
+        <w:t>4. Interactive Visa Interview Simulator (AI Voice/Chat)</w:t>
+      </w:r>
+    </w:p>
+    <w:p>
+      <w:pPr>
+        <w:numPr>
+          <w:ilvl w:val="0"/>
+          <w:numId w:val="17"/>
+        </w:numPr>
+        <w:rPr>
+          <w:b/>
+          <w:bCs/>
+          <w:sz w:val="20"/>
+          <w:szCs w:val="20"/>
+          <w:lang w:val="en-GB"/>
+        </w:rPr>
+      </w:pPr>
+      <w:r>
+        <w:rPr>
+          <w:b/>
+          <w:bCs/>
+          <w:sz w:val="20"/>
+          <w:szCs w:val="20"/>
+          <w:lang w:val="en-GB"/>
+        </w:rPr>
+        <w:t>Mock Visa Officer Interview:</w:t>
+      </w:r>
+    </w:p>
+    <w:p>
+      <w:pPr>
+        <w:numPr>
+          <w:ilvl w:val="1"/>
+          <w:numId w:val="17"/>
+        </w:numPr>
+        <w:rPr>
+          <w:b/>
+          <w:bCs/>
+          <w:sz w:val="20"/>
+          <w:szCs w:val="20"/>
+          <w:lang w:val="en-GB"/>
+        </w:rPr>
+      </w:pPr>
+      <w:r>
+        <w:rPr>
+          <w:b/>
+          <w:bCs/>
+          <w:sz w:val="20"/>
+          <w:szCs w:val="20"/>
+          <w:lang w:val="en-GB"/>
+        </w:rPr>
+        <w:t>An interactive simulation of real embassy interviews:</w:t>
+      </w:r>
+    </w:p>
+    <w:p>
+      <w:pPr>
+        <w:numPr>
+          <w:ilvl w:val="2"/>
+          <w:numId w:val="17"/>
+        </w:numPr>
+        <w:rPr>
+          <w:b/>
+          <w:bCs/>
+          <w:sz w:val="20"/>
+          <w:szCs w:val="20"/>
+          <w:lang w:val="en-GB"/>
+        </w:rPr>
+      </w:pPr>
+      <w:r>
+        <w:rPr>
+          <w:b/>
+          <w:bCs/>
+          <w:sz w:val="20"/>
+          <w:szCs w:val="20"/>
+          <w:lang w:val="en-GB"/>
+        </w:rPr>
+        <w:t>Germany: Academic questions, course syllabus breakdown, blocked account confirmation.</w:t>
+      </w:r>
+    </w:p>
+    <w:p>
+      <w:pPr>
+        <w:numPr>
+          <w:ilvl w:val="2"/>
+          <w:numId w:val="17"/>
+        </w:numPr>
+        <w:rPr>
+          <w:b/>
+          <w:bCs/>
+          <w:sz w:val="20"/>
+          <w:szCs w:val="20"/>
+          <w:lang w:val="en-GB"/>
+        </w:rPr>
+      </w:pPr>
+      <w:r>
+        <w:rPr>
+          <w:b/>
+          <w:bCs/>
+          <w:sz w:val="20"/>
+          <w:szCs w:val="20"/>
+          <w:lang w:val="en-GB"/>
+        </w:rPr>
+        <w:t>USA (F-1): Ties to Pakistan, Section 214(b) non-immigrant intent testing, sponsor questions.</w:t>
+      </w:r>
+    </w:p>
+    <w:p>
+      <w:pPr>
+        <w:numPr>
+          <w:ilvl w:val="2"/>
+          <w:numId w:val="17"/>
+        </w:numPr>
+        <w:rPr>
+          <w:b/>
+          <w:bCs/>
+          <w:sz w:val="20"/>
+          <w:szCs w:val="20"/>
+          <w:lang w:val="en-GB"/>
+        </w:rPr>
+      </w:pPr>
+      <w:r>
+        <w:rPr>
+          <w:b/>
+          <w:bCs/>
+          <w:sz w:val="20"/>
+          <w:szCs w:val="20"/>
+          <w:lang w:val="en-GB"/>
+        </w:rPr>
+        <w:t>UK: Credibility interview practice on why they chose that specific UK city and university over Pakistan.</w:t>
+      </w:r>
+    </w:p>
+    <w:p>
+      <w:pPr>
+        <w:numPr>
+          <w:ilvl w:val="1"/>
+          <w:numId w:val="17"/>
+        </w:numPr>
+        <w:rPr>
+          <w:b/>
+          <w:bCs/>
+          <w:sz w:val="20"/>
+          <w:szCs w:val="20"/>
+          <w:lang w:val="en-GB"/>
+        </w:rPr>
+      </w:pPr>
+      <w:r>
+        <w:rPr>
+          <w:b/>
+          <w:bCs/>
+          <w:sz w:val="20"/>
+          <w:szCs w:val="20"/>
+          <w:lang w:val="en-GB"/>
+        </w:rPr>
+        <w:t>Provides a score and tips to avoid common visa rejections.</w:t>
+      </w:r>
+    </w:p>
+    <w:p>
+      <w:pPr>
+        <w:rPr>
+          <w:b/>
+          <w:bCs/>
+          <w:sz w:val="20"/>
+          <w:szCs w:val="20"/>
+          <w:lang w:val="en-GB"/>
+        </w:rPr>
+      </w:pPr>
+    </w:p>
+    <w:p>
+      <w:pPr>
+        <w:rPr>
+          <w:szCs w:val="18"/>
+          <w:lang w:val="en-GB"/>
+        </w:rPr>
+      </w:pPr>
+    </w:p>
+    <w:p>
+      <w:pPr>
+        <w:rPr>
+          <w:szCs w:val="18"/>
+          <w:lang w:val="en-GB"/>
+        </w:rPr>
+      </w:pPr>
+    </w:p>
+    <w:p>
+      <w:pPr>
+        <w:rPr>
+          <w:szCs w:val="18"/>
+          <w:lang w:val="en-GB"/>
+        </w:rPr>
+      </w:pPr>
+    </w:p>
+    <w:p>
+      <w:pPr>
+        <w:rPr>
+          <w:szCs w:val="18"/>
+          <w:lang w:val="en-GB"/>
+        </w:rPr>
+      </w:pPr>
+    </w:p>
+    <w:p>
+      <w:pPr>
+        <w:rPr>
+          <w:szCs w:val="18"/>
+          <w:lang w:val="en-GB"/>
+        </w:rPr>
+      </w:pPr>
+    </w:p>
+    <w:p>
+      <w:pPr>
+        <w:rPr>
+          <w:szCs w:val="18"/>
+          <w:lang w:val="en-GB"/>
+        </w:rPr>
+      </w:pPr>
     </w:p>
     <w:p>
       <w:pPr>
@@ -2091,6 +3442,453 @@
     </w:lvl>
   </w:abstractNum>
   <w:abstractNum w:abstractNumId="9" w15:restartNumberingAfterBreak="0">
+    <w:nsid w:val="15244DCC"/>
+    <w:multiLevelType w:val="multilevel"/>
+    <w:tmpl w:val="B5BEB216"/>
+    <w:lvl w:ilvl="0">
+      <w:start w:val="1"/>
+      <w:numFmt w:val="bullet"/>
+      <w:lvlText w:val=""/>
+      <w:lvlJc w:val="left"/>
+      <w:pPr>
+        <w:tabs>
+          <w:tab w:val="num" w:pos="720"/>
+        </w:tabs>
+        <w:ind w:left="720" w:hanging="360"/>
+      </w:pPr>
+      <w:rPr>
+        <w:rFonts w:ascii="Symbol" w:hAnsi="Symbol" w:hint="default"/>
+        <w:sz w:val="20"/>
+      </w:rPr>
+    </w:lvl>
+    <w:lvl w:ilvl="1">
+      <w:start w:val="1"/>
+      <w:numFmt w:val="bullet"/>
+      <w:lvlText w:val=""/>
+      <w:lvlJc w:val="left"/>
+      <w:pPr>
+        <w:tabs>
+          <w:tab w:val="num" w:pos="1440"/>
+        </w:tabs>
+        <w:ind w:left="1440" w:hanging="360"/>
+      </w:pPr>
+      <w:rPr>
+        <w:rFonts w:ascii="Symbol" w:hAnsi="Symbol" w:hint="default"/>
+        <w:sz w:val="20"/>
+      </w:rPr>
+    </w:lvl>
+    <w:lvl w:ilvl="2" w:tentative="1">
+      <w:start w:val="1"/>
+      <w:numFmt w:val="bullet"/>
+      <w:lvlText w:val=""/>
+      <w:lvlJc w:val="left"/>
+      <w:pPr>
+        <w:tabs>
+          <w:tab w:val="num" w:pos="2160"/>
+        </w:tabs>
+        <w:ind w:left="2160" w:hanging="360"/>
+      </w:pPr>
+      <w:rPr>
+        <w:rFonts w:ascii="Symbol" w:hAnsi="Symbol" w:hint="default"/>
+        <w:sz w:val="20"/>
+      </w:rPr>
+    </w:lvl>
+    <w:lvl w:ilvl="3" w:tentative="1">
+      <w:start w:val="1"/>
+      <w:numFmt w:val="bullet"/>
+      <w:lvlText w:val=""/>
+      <w:lvlJc w:val="left"/>
+      <w:pPr>
+        <w:tabs>
+          <w:tab w:val="num" w:pos="2880"/>
+        </w:tabs>
+        <w:ind w:left="2880" w:hanging="360"/>
+      </w:pPr>
+      <w:rPr>
+        <w:rFonts w:ascii="Symbol" w:hAnsi="Symbol" w:hint="default"/>
+        <w:sz w:val="20"/>
+      </w:rPr>
+    </w:lvl>
+    <w:lvl w:ilvl="4" w:tentative="1">
+      <w:start w:val="1"/>
+      <w:numFmt w:val="bullet"/>
+      <w:lvlText w:val=""/>
+      <w:lvlJc w:val="left"/>
+      <w:pPr>
+        <w:tabs>
+          <w:tab w:val="num" w:pos="3600"/>
+        </w:tabs>
+        <w:ind w:left="3600" w:hanging="360"/>
+      </w:pPr>
+      <w:rPr>
+        <w:rFonts w:ascii="Symbol" w:hAnsi="Symbol" w:hint="default"/>
+        <w:sz w:val="20"/>
+      </w:rPr>
+    </w:lvl>
+    <w:lvl w:ilvl="5" w:tentative="1">
+      <w:start w:val="1"/>
+      <w:numFmt w:val="bullet"/>
+      <w:lvlText w:val=""/>
+      <w:lvlJc w:val="left"/>
+      <w:pPr>
+        <w:tabs>
+          <w:tab w:val="num" w:pos="4320"/>
+        </w:tabs>
+        <w:ind w:left="4320" w:hanging="360"/>
+      </w:pPr>
+      <w:rPr>
+        <w:rFonts w:ascii="Symbol" w:hAnsi="Symbol" w:hint="default"/>
+        <w:sz w:val="20"/>
+      </w:rPr>
+    </w:lvl>
+    <w:lvl w:ilvl="6" w:tentative="1">
+      <w:start w:val="1"/>
+      <w:numFmt w:val="bullet"/>
+      <w:lvlText w:val=""/>
+      <w:lvlJc w:val="left"/>
+      <w:pPr>
+        <w:tabs>
+          <w:tab w:val="num" w:pos="5040"/>
+        </w:tabs>
+        <w:ind w:left="5040" w:hanging="360"/>
+      </w:pPr>
+      <w:rPr>
+        <w:rFonts w:ascii="Symbol" w:hAnsi="Symbol" w:hint="default"/>
+        <w:sz w:val="20"/>
+      </w:rPr>
+    </w:lvl>
+    <w:lvl w:ilvl="7" w:tentative="1">
+      <w:start w:val="1"/>
+      <w:numFmt w:val="bullet"/>
+      <w:lvlText w:val=""/>
+      <w:lvlJc w:val="left"/>
+      <w:pPr>
+        <w:tabs>
+          <w:tab w:val="num" w:pos="5760"/>
+        </w:tabs>
+        <w:ind w:left="5760" w:hanging="360"/>
+      </w:pPr>
+      <w:rPr>
+        <w:rFonts w:ascii="Symbol" w:hAnsi="Symbol" w:hint="default"/>
+        <w:sz w:val="20"/>
+      </w:rPr>
+    </w:lvl>
+    <w:lvl w:ilvl="8" w:tentative="1">
+      <w:start w:val="1"/>
+      <w:numFmt w:val="bullet"/>
+      <w:lvlText w:val=""/>
+      <w:lvlJc w:val="left"/>
+      <w:pPr>
+        <w:tabs>
+          <w:tab w:val="num" w:pos="6480"/>
+        </w:tabs>
+        <w:ind w:left="6480" w:hanging="360"/>
+      </w:pPr>
+      <w:rPr>
+        <w:rFonts w:ascii="Symbol" w:hAnsi="Symbol" w:hint="default"/>
+        <w:sz w:val="20"/>
+      </w:rPr>
+    </w:lvl>
+  </w:abstractNum>
+  <w:abstractNum w:abstractNumId="10" w15:restartNumberingAfterBreak="0">
+    <w:nsid w:val="276F0D1F"/>
+    <w:multiLevelType w:val="multilevel"/>
+    <w:tmpl w:val="FB661F80"/>
+    <w:lvl w:ilvl="0">
+      <w:start w:val="1"/>
+      <w:numFmt w:val="bullet"/>
+      <w:lvlText w:val=""/>
+      <w:lvlJc w:val="left"/>
+      <w:pPr>
+        <w:tabs>
+          <w:tab w:val="num" w:pos="720"/>
+        </w:tabs>
+        <w:ind w:left="720" w:hanging="360"/>
+      </w:pPr>
+      <w:rPr>
+        <w:rFonts w:ascii="Symbol" w:hAnsi="Symbol" w:hint="default"/>
+        <w:sz w:val="20"/>
+      </w:rPr>
+    </w:lvl>
+    <w:lvl w:ilvl="1">
+      <w:start w:val="1"/>
+      <w:numFmt w:val="bullet"/>
+      <w:lvlText w:val=""/>
+      <w:lvlJc w:val="left"/>
+      <w:pPr>
+        <w:tabs>
+          <w:tab w:val="num" w:pos="1440"/>
+        </w:tabs>
+        <w:ind w:left="1440" w:hanging="360"/>
+      </w:pPr>
+      <w:rPr>
+        <w:rFonts w:ascii="Symbol" w:hAnsi="Symbol" w:hint="default"/>
+        <w:sz w:val="20"/>
+      </w:rPr>
+    </w:lvl>
+    <w:lvl w:ilvl="2" w:tentative="1">
+      <w:start w:val="1"/>
+      <w:numFmt w:val="bullet"/>
+      <w:lvlText w:val=""/>
+      <w:lvlJc w:val="left"/>
+      <w:pPr>
+        <w:tabs>
+          <w:tab w:val="num" w:pos="2160"/>
+        </w:tabs>
+        <w:ind w:left="2160" w:hanging="360"/>
+      </w:pPr>
+      <w:rPr>
+        <w:rFonts w:ascii="Symbol" w:hAnsi="Symbol" w:hint="default"/>
+        <w:sz w:val="20"/>
+      </w:rPr>
+    </w:lvl>
+    <w:lvl w:ilvl="3" w:tentative="1">
+      <w:start w:val="1"/>
+      <w:numFmt w:val="bullet"/>
+      <w:lvlText w:val=""/>
+      <w:lvlJc w:val="left"/>
+      <w:pPr>
+        <w:tabs>
+          <w:tab w:val="num" w:pos="2880"/>
+        </w:tabs>
+        <w:ind w:left="2880" w:hanging="360"/>
+      </w:pPr>
+      <w:rPr>
+        <w:rFonts w:ascii="Symbol" w:hAnsi="Symbol" w:hint="default"/>
+        <w:sz w:val="20"/>
+      </w:rPr>
+    </w:lvl>
+    <w:lvl w:ilvl="4" w:tentative="1">
+      <w:start w:val="1"/>
+      <w:numFmt w:val="bullet"/>
+      <w:lvlText w:val=""/>
+      <w:lvlJc w:val="left"/>
+      <w:pPr>
+        <w:tabs>
+          <w:tab w:val="num" w:pos="3600"/>
+        </w:tabs>
+        <w:ind w:left="3600" w:hanging="360"/>
+      </w:pPr>
+      <w:rPr>
+        <w:rFonts w:ascii="Symbol" w:hAnsi="Symbol" w:hint="default"/>
+        <w:sz w:val="20"/>
+      </w:rPr>
+    </w:lvl>
+    <w:lvl w:ilvl="5" w:tentative="1">
+      <w:start w:val="1"/>
+      <w:numFmt w:val="bullet"/>
+      <w:lvlText w:val=""/>
+      <w:lvlJc w:val="left"/>
+      <w:pPr>
+        <w:tabs>
+          <w:tab w:val="num" w:pos="4320"/>
+        </w:tabs>
+        <w:ind w:left="4320" w:hanging="360"/>
+      </w:pPr>
+      <w:rPr>
+        <w:rFonts w:ascii="Symbol" w:hAnsi="Symbol" w:hint="default"/>
+        <w:sz w:val="20"/>
+      </w:rPr>
+    </w:lvl>
+    <w:lvl w:ilvl="6" w:tentative="1">
+      <w:start w:val="1"/>
+      <w:numFmt w:val="bullet"/>
+      <w:lvlText w:val=""/>
+      <w:lvlJc w:val="left"/>
+      <w:pPr>
+        <w:tabs>
+          <w:tab w:val="num" w:pos="5040"/>
+        </w:tabs>
+        <w:ind w:left="5040" w:hanging="360"/>
+      </w:pPr>
+      <w:rPr>
+        <w:rFonts w:ascii="Symbol" w:hAnsi="Symbol" w:hint="default"/>
+        <w:sz w:val="20"/>
+      </w:rPr>
+    </w:lvl>
+    <w:lvl w:ilvl="7" w:tentative="1">
+      <w:start w:val="1"/>
+      <w:numFmt w:val="bullet"/>
+      <w:lvlText w:val=""/>
+      <w:lvlJc w:val="left"/>
+      <w:pPr>
+        <w:tabs>
+          <w:tab w:val="num" w:pos="5760"/>
+        </w:tabs>
+        <w:ind w:left="5760" w:hanging="360"/>
+      </w:pPr>
+      <w:rPr>
+        <w:rFonts w:ascii="Symbol" w:hAnsi="Symbol" w:hint="default"/>
+        <w:sz w:val="20"/>
+      </w:rPr>
+    </w:lvl>
+    <w:lvl w:ilvl="8" w:tentative="1">
+      <w:start w:val="1"/>
+      <w:numFmt w:val="bullet"/>
+      <w:lvlText w:val=""/>
+      <w:lvlJc w:val="left"/>
+      <w:pPr>
+        <w:tabs>
+          <w:tab w:val="num" w:pos="6480"/>
+        </w:tabs>
+        <w:ind w:left="6480" w:hanging="360"/>
+      </w:pPr>
+      <w:rPr>
+        <w:rFonts w:ascii="Symbol" w:hAnsi="Symbol" w:hint="default"/>
+        <w:sz w:val="20"/>
+      </w:rPr>
+    </w:lvl>
+  </w:abstractNum>
+  <w:abstractNum w:abstractNumId="11" w15:restartNumberingAfterBreak="0">
+    <w:nsid w:val="5686167B"/>
+    <w:multiLevelType w:val="multilevel"/>
+    <w:tmpl w:val="296C6C8A"/>
+    <w:lvl w:ilvl="0">
+      <w:start w:val="1"/>
+      <w:numFmt w:val="bullet"/>
+      <w:lvlText w:val=""/>
+      <w:lvlJc w:val="left"/>
+      <w:pPr>
+        <w:tabs>
+          <w:tab w:val="num" w:pos="720"/>
+        </w:tabs>
+        <w:ind w:left="720" w:hanging="360"/>
+      </w:pPr>
+      <w:rPr>
+        <w:rFonts w:ascii="Symbol" w:hAnsi="Symbol" w:hint="default"/>
+        <w:sz w:val="20"/>
+      </w:rPr>
+    </w:lvl>
+    <w:lvl w:ilvl="1">
+      <w:start w:val="1"/>
+      <w:numFmt w:val="bullet"/>
+      <w:lvlText w:val=""/>
+      <w:lvlJc w:val="left"/>
+      <w:pPr>
+        <w:tabs>
+          <w:tab w:val="num" w:pos="1440"/>
+        </w:tabs>
+        <w:ind w:left="1440" w:hanging="360"/>
+      </w:pPr>
+      <w:rPr>
+        <w:rFonts w:ascii="Symbol" w:hAnsi="Symbol" w:hint="default"/>
+        <w:sz w:val="20"/>
+      </w:rPr>
+    </w:lvl>
+    <w:lvl w:ilvl="2">
+      <w:start w:val="1"/>
+      <w:numFmt w:val="bullet"/>
+      <w:lvlText w:val=""/>
+      <w:lvlJc w:val="left"/>
+      <w:pPr>
+        <w:tabs>
+          <w:tab w:val="num" w:pos="2160"/>
+        </w:tabs>
+        <w:ind w:left="2160" w:hanging="360"/>
+      </w:pPr>
+      <w:rPr>
+        <w:rFonts w:ascii="Symbol" w:hAnsi="Symbol" w:hint="default"/>
+        <w:sz w:val="20"/>
+      </w:rPr>
+    </w:lvl>
+    <w:lvl w:ilvl="3" w:tentative="1">
+      <w:start w:val="1"/>
+      <w:numFmt w:val="bullet"/>
+      <w:lvlText w:val=""/>
+      <w:lvlJc w:val="left"/>
+      <w:pPr>
+        <w:tabs>
+          <w:tab w:val="num" w:pos="2880"/>
+        </w:tabs>
+        <w:ind w:left="2880" w:hanging="360"/>
+      </w:pPr>
+      <w:rPr>
+        <w:rFonts w:ascii="Symbol" w:hAnsi="Symbol" w:hint="default"/>
+        <w:sz w:val="20"/>
+      </w:rPr>
+    </w:lvl>
+    <w:lvl w:ilvl="4" w:tentative="1">
+      <w:start w:val="1"/>
+      <w:numFmt w:val="bullet"/>
+      <w:lvlText w:val=""/>
+      <w:lvlJc w:val="left"/>
+      <w:pPr>
+        <w:tabs>
+          <w:tab w:val="num" w:pos="3600"/>
+        </w:tabs>
+        <w:ind w:left="3600" w:hanging="360"/>
+      </w:pPr>
+      <w:rPr>
+        <w:rFonts w:ascii="Symbol" w:hAnsi="Symbol" w:hint="default"/>
+        <w:sz w:val="20"/>
+      </w:rPr>
+    </w:lvl>
+    <w:lvl w:ilvl="5" w:tentative="1">
+      <w:start w:val="1"/>
+      <w:numFmt w:val="bullet"/>
+      <w:lvlText w:val=""/>
+      <w:lvlJc w:val="left"/>
+      <w:pPr>
+        <w:tabs>
+          <w:tab w:val="num" w:pos="4320"/>
+        </w:tabs>
+        <w:ind w:left="4320" w:hanging="360"/>
+      </w:pPr>
+      <w:rPr>
+        <w:rFonts w:ascii="Symbol" w:hAnsi="Symbol" w:hint="default"/>
+        <w:sz w:val="20"/>
+      </w:rPr>
+    </w:lvl>
+    <w:lvl w:ilvl="6" w:tentative="1">
+      <w:start w:val="1"/>
+      <w:numFmt w:val="bullet"/>
+      <w:lvlText w:val=""/>
+      <w:lvlJc w:val="left"/>
+      <w:pPr>
+        <w:tabs>
+          <w:tab w:val="num" w:pos="5040"/>
+        </w:tabs>
+        <w:ind w:left="5040" w:hanging="360"/>
+      </w:pPr>
+      <w:rPr>
+        <w:rFonts w:ascii="Symbol" w:hAnsi="Symbol" w:hint="default"/>
+        <w:sz w:val="20"/>
+      </w:rPr>
+    </w:lvl>
+    <w:lvl w:ilvl="7" w:tentative="1">
+      <w:start w:val="1"/>
+      <w:numFmt w:val="bullet"/>
+      <w:lvlText w:val=""/>
+      <w:lvlJc w:val="left"/>
+      <w:pPr>
+        <w:tabs>
+          <w:tab w:val="num" w:pos="5760"/>
+        </w:tabs>
+        <w:ind w:left="5760" w:hanging="360"/>
+      </w:pPr>
+      <w:rPr>
+        <w:rFonts w:ascii="Symbol" w:hAnsi="Symbol" w:hint="default"/>
+        <w:sz w:val="20"/>
+      </w:rPr>
+    </w:lvl>
+    <w:lvl w:ilvl="8" w:tentative="1">
+      <w:start w:val="1"/>
+      <w:numFmt w:val="bullet"/>
+      <w:lvlText w:val=""/>
+      <w:lvlJc w:val="left"/>
+      <w:pPr>
+        <w:tabs>
+          <w:tab w:val="num" w:pos="6480"/>
+        </w:tabs>
+        <w:ind w:left="6480" w:hanging="360"/>
+      </w:pPr>
+      <w:rPr>
+        <w:rFonts w:ascii="Symbol" w:hAnsi="Symbol" w:hint="default"/>
+        <w:sz w:val="20"/>
+      </w:rPr>
+    </w:lvl>
+  </w:abstractNum>
+  <w:abstractNum w:abstractNumId="12" w15:restartNumberingAfterBreak="0">
     <w:nsid w:val="5F242F52"/>
     <w:multiLevelType w:val="multilevel"/>
     <w:tmpl w:val="36B40D2C"/>
@@ -2203,7 +4001,156 @@
       </w:pPr>
     </w:lvl>
   </w:abstractNum>
-  <w:abstractNum w:abstractNumId="10" w15:restartNumberingAfterBreak="0">
+  <w:abstractNum w:abstractNumId="13" w15:restartNumberingAfterBreak="0">
+    <w:nsid w:val="61C917BE"/>
+    <w:multiLevelType w:val="multilevel"/>
+    <w:tmpl w:val="32125F5C"/>
+    <w:lvl w:ilvl="0">
+      <w:start w:val="1"/>
+      <w:numFmt w:val="bullet"/>
+      <w:lvlText w:val=""/>
+      <w:lvlJc w:val="left"/>
+      <w:pPr>
+        <w:tabs>
+          <w:tab w:val="num" w:pos="720"/>
+        </w:tabs>
+        <w:ind w:left="720" w:hanging="360"/>
+      </w:pPr>
+      <w:rPr>
+        <w:rFonts w:ascii="Symbol" w:hAnsi="Symbol" w:hint="default"/>
+        <w:sz w:val="20"/>
+      </w:rPr>
+    </w:lvl>
+    <w:lvl w:ilvl="1">
+      <w:start w:val="1"/>
+      <w:numFmt w:val="bullet"/>
+      <w:lvlText w:val=""/>
+      <w:lvlJc w:val="left"/>
+      <w:pPr>
+        <w:tabs>
+          <w:tab w:val="num" w:pos="1440"/>
+        </w:tabs>
+        <w:ind w:left="1440" w:hanging="360"/>
+      </w:pPr>
+      <w:rPr>
+        <w:rFonts w:ascii="Symbol" w:hAnsi="Symbol" w:hint="default"/>
+        <w:sz w:val="20"/>
+      </w:rPr>
+    </w:lvl>
+    <w:lvl w:ilvl="2" w:tentative="1">
+      <w:start w:val="1"/>
+      <w:numFmt w:val="bullet"/>
+      <w:lvlText w:val=""/>
+      <w:lvlJc w:val="left"/>
+      <w:pPr>
+        <w:tabs>
+          <w:tab w:val="num" w:pos="2160"/>
+        </w:tabs>
+        <w:ind w:left="2160" w:hanging="360"/>
+      </w:pPr>
+      <w:rPr>
+        <w:rFonts w:ascii="Symbol" w:hAnsi="Symbol" w:hint="default"/>
+        <w:sz w:val="20"/>
+      </w:rPr>
+    </w:lvl>
+    <w:lvl w:ilvl="3" w:tentative="1">
+      <w:start w:val="1"/>
+      <w:numFmt w:val="bullet"/>
+      <w:lvlText w:val=""/>
+      <w:lvlJc w:val="left"/>
+      <w:pPr>
+        <w:tabs>
+          <w:tab w:val="num" w:pos="2880"/>
+        </w:tabs>
+        <w:ind w:left="2880" w:hanging="360"/>
+      </w:pPr>
+      <w:rPr>
+        <w:rFonts w:ascii="Symbol" w:hAnsi="Symbol" w:hint="default"/>
+        <w:sz w:val="20"/>
+      </w:rPr>
+    </w:lvl>
+    <w:lvl w:ilvl="4" w:tentative="1">
+      <w:start w:val="1"/>
+      <w:numFmt w:val="bullet"/>
+      <w:lvlText w:val=""/>
+      <w:lvlJc w:val="left"/>
+      <w:pPr>
+        <w:tabs>
+          <w:tab w:val="num" w:pos="3600"/>
+        </w:tabs>
+        <w:ind w:left="3600" w:hanging="360"/>
+      </w:pPr>
+      <w:rPr>
+        <w:rFonts w:ascii="Symbol" w:hAnsi="Symbol" w:hint="default"/>
+        <w:sz w:val="20"/>
+      </w:rPr>
+    </w:lvl>
+    <w:lvl w:ilvl="5" w:tentative="1">
+      <w:start w:val="1"/>
+      <w:numFmt w:val="bullet"/>
+      <w:lvlText w:val=""/>
+      <w:lvlJc w:val="left"/>
+      <w:pPr>
+        <w:tabs>
+          <w:tab w:val="num" w:pos="4320"/>
+        </w:tabs>
+        <w:ind w:left="4320" w:hanging="360"/>
+      </w:pPr>
+      <w:rPr>
+        <w:rFonts w:ascii="Symbol" w:hAnsi="Symbol" w:hint="default"/>
+        <w:sz w:val="20"/>
+      </w:rPr>
+    </w:lvl>
+    <w:lvl w:ilvl="6" w:tentative="1">
+      <w:start w:val="1"/>
+      <w:numFmt w:val="bullet"/>
+      <w:lvlText w:val=""/>
+      <w:lvlJc w:val="left"/>
+      <w:pPr>
+        <w:tabs>
+          <w:tab w:val="num" w:pos="5040"/>
+        </w:tabs>
+        <w:ind w:left="5040" w:hanging="360"/>
+      </w:pPr>
+      <w:rPr>
+        <w:rFonts w:ascii="Symbol" w:hAnsi="Symbol" w:hint="default"/>
+        <w:sz w:val="20"/>
+      </w:rPr>
+    </w:lvl>
+    <w:lvl w:ilvl="7" w:tentative="1">
+      <w:start w:val="1"/>
+      <w:numFmt w:val="bullet"/>
+      <w:lvlText w:val=""/>
+      <w:lvlJc w:val="left"/>
+      <w:pPr>
+        <w:tabs>
+          <w:tab w:val="num" w:pos="5760"/>
+        </w:tabs>
+        <w:ind w:left="5760" w:hanging="360"/>
+      </w:pPr>
+      <w:rPr>
+        <w:rFonts w:ascii="Symbol" w:hAnsi="Symbol" w:hint="default"/>
+        <w:sz w:val="20"/>
+      </w:rPr>
+    </w:lvl>
+    <w:lvl w:ilvl="8" w:tentative="1">
+      <w:start w:val="1"/>
+      <w:numFmt w:val="bullet"/>
+      <w:lvlText w:val=""/>
+      <w:lvlJc w:val="left"/>
+      <w:pPr>
+        <w:tabs>
+          <w:tab w:val="num" w:pos="6480"/>
+        </w:tabs>
+        <w:ind w:left="6480" w:hanging="360"/>
+      </w:pPr>
+      <w:rPr>
+        <w:rFonts w:ascii="Symbol" w:hAnsi="Symbol" w:hint="default"/>
+        <w:sz w:val="20"/>
+      </w:rPr>
+    </w:lvl>
+  </w:abstractNum>
+  <w:abstractNum w:abstractNumId="14" w15:restartNumberingAfterBreak="0">
     <w:nsid w:val="6BC11122"/>
     <w:multiLevelType w:val="multilevel"/>
     <w:tmpl w:val="0E009CE8"/>
@@ -2320,7 +4267,7 @@
       </w:pPr>
     </w:lvl>
   </w:abstractNum>
-  <w:abstractNum w:abstractNumId="11" w15:restartNumberingAfterBreak="0">
+  <w:abstractNum w:abstractNumId="15" w15:restartNumberingAfterBreak="0">
     <w:nsid w:val="71312733"/>
     <w:multiLevelType w:val="multilevel"/>
     <w:tmpl w:val="1688CA90"/>
@@ -2433,7 +4380,7 @@
       </w:pPr>
     </w:lvl>
   </w:abstractNum>
-  <w:abstractNum w:abstractNumId="12" w15:restartNumberingAfterBreak="0">
+  <w:abstractNum w:abstractNumId="16" w15:restartNumberingAfterBreak="0">
     <w:nsid w:val="7F33163E"/>
     <w:multiLevelType w:val="multilevel"/>
     <w:tmpl w:val="05D04132"/>
@@ -2610,16 +4557,28 @@
     <w:abstractNumId w:val="0"/>
   </w:num>
   <w:num w:numId="10" w16cid:durableId="1203053463">
-    <w:abstractNumId w:val="11"/>
+    <w:abstractNumId w:val="15"/>
   </w:num>
   <w:num w:numId="11" w16cid:durableId="43255820">
+    <w:abstractNumId w:val="14"/>
+  </w:num>
+  <w:num w:numId="12" w16cid:durableId="1636331557">
+    <w:abstractNumId w:val="12"/>
+  </w:num>
+  <w:num w:numId="13" w16cid:durableId="1053314822">
+    <w:abstractNumId w:val="16"/>
+  </w:num>
+  <w:num w:numId="14" w16cid:durableId="1976714059">
+    <w:abstractNumId w:val="13"/>
+  </w:num>
+  <w:num w:numId="15" w16cid:durableId="1044409370">
+    <w:abstractNumId w:val="9"/>
+  </w:num>
+  <w:num w:numId="16" w16cid:durableId="1982077609">
     <w:abstractNumId w:val="10"/>
   </w:num>
-  <w:num w:numId="12" w16cid:durableId="1636331557">
-    <w:abstractNumId w:val="9"/>
-  </w:num>
-  <w:num w:numId="13" w16cid:durableId="1053314822">
-    <w:abstractNumId w:val="12"/>
+  <w:num w:numId="17" w16cid:durableId="728574853">
+    <w:abstractNumId w:val="11"/>
   </w:num>
 </w:numbering>
 </file>

</xml_diff>